<commit_message>
docs: document gold modeling protocol
</commit_message>
<xml_diff>
--- a/docs/gestao-demandas-grupo-5.docx
+++ b/docs/gestao-demandas-grupo-5.docx
@@ -3199,6 +3199,78 @@
           </w:p>
         </w:tc>
       </w:tr>
+      <w:tr>
+        <w:tc>
+          <w:tcPr>
+            <w:tcW w:type="dxa" w:w="1473"/>
+          </w:tcPr>
+          <w:p>
+            <w:r>
+              <w:t>14/09/2026</w:t>
+            </w:r>
+          </w:p>
+        </w:tc>
+        <w:tc>
+          <w:tcPr>
+            <w:tcW w:type="dxa" w:w="1473"/>
+          </w:tcPr>
+          <w:p>
+            <w:r>
+              <w:t>Grupo 5</w:t>
+            </w:r>
+          </w:p>
+        </w:tc>
+        <w:tc>
+          <w:tcPr>
+            <w:tcW w:type="dxa" w:w="1473"/>
+          </w:tcPr>
+          <w:p>
+            <w:r>
+              <w:t>Preparação reproduzível da primeira base de previsão do ouro</w:t>
+            </w:r>
+          </w:p>
+        </w:tc>
+        <w:tc>
+          <w:tcPr>
+            <w:tcW w:type="dxa" w:w="1473"/>
+          </w:tcPr>
+          <w:p>
+            <w:r>
+              <w:t>bases/raw; src/prepare_gold_dataset.py; pytest (5 passed)</w:t>
+            </w:r>
+          </w:p>
+        </w:tc>
+        <w:tc>
+          <w:tcPr>
+            <w:tcW w:type="dxa" w:w="1473"/>
+          </w:tcPr>
+          <w:p>
+            <w:r>
+              <w:t>Média</w:t>
+            </w:r>
+          </w:p>
+        </w:tc>
+        <w:tc>
+          <w:tcPr>
+            <w:tcW w:type="dxa" w:w="1473"/>
+          </w:tcPr>
+          <w:p>
+            <w:r>
+              <w:t>Alta</w:t>
+            </w:r>
+          </w:p>
+        </w:tc>
+        <w:tc>
+          <w:tcPr>
+            <w:tcW w:type="dxa" w:w="1473"/>
+          </w:tcPr>
+          <w:p>
+            <w:r>
+              <w:t>Concluída</w:t>
+            </w:r>
+          </w:p>
+        </w:tc>
+      </w:tr>
     </w:tbl>
     <w:p/>
     <w:p>

</xml_diff>

<commit_message>
feat: prepare gold forecasting dataset (#3)
* chore: freeze gold and FRED raw datasets

* feat: build gold dataset preparation pipeline

* docs: document gold modeling protocol
</commit_message>
<xml_diff>
--- a/docs/gestao-demandas-grupo-5.docx
+++ b/docs/gestao-demandas-grupo-5.docx
@@ -3199,6 +3199,78 @@
           </w:p>
         </w:tc>
       </w:tr>
+      <w:tr>
+        <w:tc>
+          <w:tcPr>
+            <w:tcW w:type="dxa" w:w="1473"/>
+          </w:tcPr>
+          <w:p>
+            <w:r>
+              <w:t>14/09/2026</w:t>
+            </w:r>
+          </w:p>
+        </w:tc>
+        <w:tc>
+          <w:tcPr>
+            <w:tcW w:type="dxa" w:w="1473"/>
+          </w:tcPr>
+          <w:p>
+            <w:r>
+              <w:t>Grupo 5</w:t>
+            </w:r>
+          </w:p>
+        </w:tc>
+        <w:tc>
+          <w:tcPr>
+            <w:tcW w:type="dxa" w:w="1473"/>
+          </w:tcPr>
+          <w:p>
+            <w:r>
+              <w:t>Preparação reproduzível da primeira base de previsão do ouro</w:t>
+            </w:r>
+          </w:p>
+        </w:tc>
+        <w:tc>
+          <w:tcPr>
+            <w:tcW w:type="dxa" w:w="1473"/>
+          </w:tcPr>
+          <w:p>
+            <w:r>
+              <w:t>bases/raw; src/prepare_gold_dataset.py; pytest (5 passed)</w:t>
+            </w:r>
+          </w:p>
+        </w:tc>
+        <w:tc>
+          <w:tcPr>
+            <w:tcW w:type="dxa" w:w="1473"/>
+          </w:tcPr>
+          <w:p>
+            <w:r>
+              <w:t>Média</w:t>
+            </w:r>
+          </w:p>
+        </w:tc>
+        <w:tc>
+          <w:tcPr>
+            <w:tcW w:type="dxa" w:w="1473"/>
+          </w:tcPr>
+          <w:p>
+            <w:r>
+              <w:t>Alta</w:t>
+            </w:r>
+          </w:p>
+        </w:tc>
+        <w:tc>
+          <w:tcPr>
+            <w:tcW w:type="dxa" w:w="1473"/>
+          </w:tcPr>
+          <w:p>
+            <w:r>
+              <w:t>Concluída</w:t>
+            </w:r>
+          </w:p>
+        </w:tc>
+      </w:tr>
     </w:tbl>
     <w:p/>
     <w:p>

</xml_diff>

<commit_message>
feat: reorganiza base consolidada do grupo 5
</commit_message>
<xml_diff>
--- a/docs/gestao-demandas-grupo-5.docx
+++ b/docs/gestao-demandas-grupo-5.docx
@@ -3271,6 +3271,78 @@
           </w:p>
         </w:tc>
       </w:tr>
+      <w:tr>
+        <w:tc>
+          <w:tcPr>
+            <w:tcW w:type="dxa" w:w="1473"/>
+          </w:tcPr>
+          <w:p>
+            <w:r>
+              <w:t>21/09/2026</w:t>
+            </w:r>
+          </w:p>
+        </w:tc>
+        <w:tc>
+          <w:tcPr>
+            <w:tcW w:type="dxa" w:w="1473"/>
+          </w:tcPr>
+          <w:p>
+            <w:r>
+              <w:t>Grupo 5</w:t>
+            </w:r>
+          </w:p>
+        </w:tc>
+        <w:tc>
+          <w:tcPr>
+            <w:tcW w:type="dxa" w:w="1473"/>
+          </w:tcPr>
+          <w:p>
+            <w:r>
+              <w:t>Sincronizacao de branches e reorganizacao da base consolidada</w:t>
+            </w:r>
+          </w:p>
+        </w:tc>
+        <w:tc>
+          <w:tcPr>
+            <w:tcW w:type="dxa" w:w="1473"/>
+          </w:tcPr>
+          <w:p>
+            <w:r>
+              <w:t>develop f88d30c; bases/grupo5; bases/grupo5-tratamento; pytest (5 passed); reproducao sem divergencia de valores</w:t>
+            </w:r>
+          </w:p>
+        </w:tc>
+        <w:tc>
+          <w:tcPr>
+            <w:tcW w:type="dxa" w:w="1473"/>
+          </w:tcPr>
+          <w:p>
+            <w:r>
+              <w:t>Media</w:t>
+            </w:r>
+          </w:p>
+        </w:tc>
+        <w:tc>
+          <w:tcPr>
+            <w:tcW w:type="dxa" w:w="1473"/>
+          </w:tcPr>
+          <w:p>
+            <w:r>
+              <w:t>Media</w:t>
+            </w:r>
+          </w:p>
+        </w:tc>
+        <w:tc>
+          <w:tcPr>
+            <w:tcW w:type="dxa" w:w="1473"/>
+          </w:tcPr>
+          <w:p>
+            <w:r>
+              <w:t>Concluida</w:t>
+            </w:r>
+          </w:p>
+        </w:tc>
+      </w:tr>
     </w:tbl>
     <w:p/>
     <w:p>

</xml_diff>